<commit_message>
docs(arena): update content refresh dates to 2026-03-10
- Update highlight cards and best practice reasons across all arenas
- Refresh content update/review dates to 2026-03-10
- Update GLM model references from 4.7 to 5
- Sync Chinese and English translations
- Update skill documentation formatting

Co-Authored-By: Claude Opus 4.6 <noreply@anthropic.com>
</commit_message>
<xml_diff>
--- a/Content/Arena/All Arenas/1-intelligent-research-system/Original Documents/一周搭建企业级智能调研报告生成系统Demo.docx
+++ b/Content/Arena/All Arenas/1-intelligent-research-system/Original Documents/一周搭建企业级智能调研报告生成系统Demo.docx
@@ -954,7 +954,7 @@
                 <w:rFonts w:eastAsia="等线" w:ascii="Arial" w:cs="Arial" w:hAnsi="Arial"/>
                 <w:sz w:val="22"/>
               </w:rPr>
-              <w:t>该方案支持以GLM-4.7等API收费相对更低的高性能大模型为基座，从而节省近60%运营成本。</w:t>
+              <w:t>该方案支持以GLM-5等API收费相对更低的高性能大模型为基座，从而节省近60%运营成本。</w:t>
             </w:r>
           </w:p>
           <w:p>
@@ -1221,14 +1221,14 @@
                 <w:rFonts w:eastAsia="等线" w:ascii="Arial" w:cs="Arial" w:hAnsi="Arial"/>
                 <w:sz w:val="22"/>
               </w:rPr>
-              <w:t>GLM-4.7(by 智谱) GitHub：</w:t>
-            </w:r>
-            <w:r>
-              <w:rPr>
-                <w:rFonts w:eastAsia="等线" w:ascii="Arial" w:cs="Arial" w:hAnsi="Arial"/>
-                <w:sz w:val="22"/>
-              </w:rPr>
-              <w:t>https://github.com/zai-org/GLM-4.5</w:t>
+              <w:t>GLM-5(by 智谱) GitHub：</w:t>
+            </w:r>
+            <w:r>
+              <w:rPr>
+                <w:rFonts w:eastAsia="等线" w:ascii="Arial" w:cs="Arial" w:hAnsi="Arial"/>
+                <w:sz w:val="22"/>
+              </w:rPr>
+              <w:t>https://github.com/zai-org/GLM-5</w:t>
             </w:r>
           </w:p>
           <w:p>
@@ -1279,7 +1279,7 @@
                 <w:rFonts w:eastAsia="等线" w:ascii="Arial" w:cs="Arial" w:hAnsi="Arial"/>
                 <w:sz w:val="22"/>
               </w:rPr>
-              <w:t>最近更新：2026-02-02</w:t>
+              <w:t>最近更新：2026-03-10</w:t>
             </w:r>
           </w:p>
           <w:p>
@@ -1296,7 +1296,7 @@
                 <w:rFonts w:eastAsia="等线" w:ascii="Arial" w:cs="Arial" w:hAnsi="Arial"/>
                 <w:sz w:val="22"/>
               </w:rPr>
-              <w:t>最近审阅：2026-02-02</w:t>
+              <w:t>最近审阅：2026-03-10</w:t>
             </w:r>
           </w:p>
         </w:tc>
@@ -1401,7 +1401,7 @@
 
 <file path=word/numbering.xml><?xml version="1.0" encoding="utf-8"?>
 <w:numbering xmlns:w="http://schemas.openxmlformats.org/wordprocessingml/2006/main">
-  <w:abstractNum w:abstractNumId="89060">
+  <w:abstractNum w:abstractNumId="728450">
     <w:lvl>
       <w:numFmt w:val="bullet"/>
       <w:suff w:val="tab"/>
@@ -1411,7 +1411,7 @@
       </w:rPr>
     </w:lvl>
   </w:abstractNum>
-  <w:abstractNum w:abstractNumId="89061">
+  <w:abstractNum w:abstractNumId="728451">
     <w:lvl>
       <w:numFmt w:val="bullet"/>
       <w:suff w:val="tab"/>
@@ -1421,7 +1421,7 @@
       </w:rPr>
     </w:lvl>
   </w:abstractNum>
-  <w:abstractNum w:abstractNumId="89062">
+  <w:abstractNum w:abstractNumId="728452">
     <w:lvl>
       <w:numFmt w:val="bullet"/>
       <w:suff w:val="tab"/>
@@ -1431,7 +1431,7 @@
       </w:rPr>
     </w:lvl>
   </w:abstractNum>
-  <w:abstractNum w:abstractNumId="89063">
+  <w:abstractNum w:abstractNumId="728453">
     <w:lvl>
       <w:numFmt w:val="bullet"/>
       <w:suff w:val="tab"/>
@@ -1441,7 +1441,7 @@
       </w:rPr>
     </w:lvl>
   </w:abstractNum>
-  <w:abstractNum w:abstractNumId="89064">
+  <w:abstractNum w:abstractNumId="728454">
     <w:lvl>
       <w:numFmt w:val="bullet"/>
       <w:suff w:val="tab"/>
@@ -1451,7 +1451,7 @@
       </w:rPr>
     </w:lvl>
   </w:abstractNum>
-  <w:abstractNum w:abstractNumId="89065">
+  <w:abstractNum w:abstractNumId="728455">
     <w:lvl>
       <w:numFmt w:val="bullet"/>
       <w:suff w:val="tab"/>
@@ -1461,7 +1461,7 @@
       </w:rPr>
     </w:lvl>
   </w:abstractNum>
-  <w:abstractNum w:abstractNumId="89066">
+  <w:abstractNum w:abstractNumId="728456">
     <w:lvl>
       <w:numFmt w:val="bullet"/>
       <w:suff w:val="tab"/>
@@ -1471,7 +1471,7 @@
       </w:rPr>
     </w:lvl>
   </w:abstractNum>
-  <w:abstractNum w:abstractNumId="89067">
+  <w:abstractNum w:abstractNumId="728457">
     <w:lvl>
       <w:numFmt w:val="bullet"/>
       <w:suff w:val="tab"/>
@@ -1481,7 +1481,7 @@
       </w:rPr>
     </w:lvl>
   </w:abstractNum>
-  <w:abstractNum w:abstractNumId="89068">
+  <w:abstractNum w:abstractNumId="728458">
     <w:lvl>
       <w:numFmt w:val="bullet"/>
       <w:suff w:val="tab"/>
@@ -1491,7 +1491,7 @@
       </w:rPr>
     </w:lvl>
   </w:abstractNum>
-  <w:abstractNum w:abstractNumId="89069">
+  <w:abstractNum w:abstractNumId="728459">
     <w:lvl>
       <w:numFmt w:val="bullet"/>
       <w:suff w:val="tab"/>
@@ -1501,7 +1501,7 @@
       </w:rPr>
     </w:lvl>
   </w:abstractNum>
-  <w:abstractNum w:abstractNumId="89070">
+  <w:abstractNum w:abstractNumId="728460">
     <w:lvl>
       <w:numFmt w:val="bullet"/>
       <w:suff w:val="tab"/>
@@ -1511,7 +1511,7 @@
       </w:rPr>
     </w:lvl>
   </w:abstractNum>
-  <w:abstractNum w:abstractNumId="89071">
+  <w:abstractNum w:abstractNumId="728461">
     <w:lvl>
       <w:numFmt w:val="bullet"/>
       <w:suff w:val="tab"/>
@@ -1521,7 +1521,7 @@
       </w:rPr>
     </w:lvl>
   </w:abstractNum>
-  <w:abstractNum w:abstractNumId="89072">
+  <w:abstractNum w:abstractNumId="728462">
     <w:lvl>
       <w:numFmt w:val="bullet"/>
       <w:suff w:val="tab"/>
@@ -1531,7 +1531,7 @@
       </w:rPr>
     </w:lvl>
   </w:abstractNum>
-  <w:abstractNum w:abstractNumId="89073">
+  <w:abstractNum w:abstractNumId="728463">
     <w:lvl>
       <w:numFmt w:val="bullet"/>
       <w:suff w:val="tab"/>
@@ -1541,7 +1541,7 @@
       </w:rPr>
     </w:lvl>
   </w:abstractNum>
-  <w:abstractNum w:abstractNumId="89074">
+  <w:abstractNum w:abstractNumId="728464">
     <w:lvl>
       <w:numFmt w:val="bullet"/>
       <w:suff w:val="tab"/>
@@ -1551,7 +1551,7 @@
       </w:rPr>
     </w:lvl>
   </w:abstractNum>
-  <w:abstractNum w:abstractNumId="89075">
+  <w:abstractNum w:abstractNumId="728465">
     <w:lvl>
       <w:numFmt w:val="bullet"/>
       <w:suff w:val="tab"/>
@@ -1561,7 +1561,7 @@
       </w:rPr>
     </w:lvl>
   </w:abstractNum>
-  <w:abstractNum w:abstractNumId="89076">
+  <w:abstractNum w:abstractNumId="728466">
     <w:lvl>
       <w:numFmt w:val="bullet"/>
       <w:suff w:val="tab"/>
@@ -1571,7 +1571,7 @@
       </w:rPr>
     </w:lvl>
   </w:abstractNum>
-  <w:abstractNum w:abstractNumId="89077">
+  <w:abstractNum w:abstractNumId="728467">
     <w:lvl>
       <w:numFmt w:val="bullet"/>
       <w:suff w:val="tab"/>
@@ -1581,7 +1581,7 @@
       </w:rPr>
     </w:lvl>
   </w:abstractNum>
-  <w:abstractNum w:abstractNumId="89078">
+  <w:abstractNum w:abstractNumId="728468">
     <w:lvl>
       <w:numFmt w:val="bullet"/>
       <w:suff w:val="tab"/>
@@ -1591,7 +1591,7 @@
       </w:rPr>
     </w:lvl>
   </w:abstractNum>
-  <w:abstractNum w:abstractNumId="89079">
+  <w:abstractNum w:abstractNumId="728469">
     <w:lvl>
       <w:numFmt w:val="bullet"/>
       <w:suff w:val="tab"/>
@@ -1601,7 +1601,7 @@
       </w:rPr>
     </w:lvl>
   </w:abstractNum>
-  <w:abstractNum w:abstractNumId="89080">
+  <w:abstractNum w:abstractNumId="728470">
     <w:lvl>
       <w:numFmt w:val="bullet"/>
       <w:suff w:val="tab"/>
@@ -1611,7 +1611,7 @@
       </w:rPr>
     </w:lvl>
   </w:abstractNum>
-  <w:abstractNum w:abstractNumId="89081">
+  <w:abstractNum w:abstractNumId="728471">
     <w:lvl>
       <w:numFmt w:val="bullet"/>
       <w:suff w:val="tab"/>
@@ -1621,7 +1621,7 @@
       </w:rPr>
     </w:lvl>
   </w:abstractNum>
-  <w:abstractNum w:abstractNumId="89082">
+  <w:abstractNum w:abstractNumId="728472">
     <w:lvl>
       <w:numFmt w:val="bullet"/>
       <w:suff w:val="tab"/>
@@ -1631,7 +1631,7 @@
       </w:rPr>
     </w:lvl>
   </w:abstractNum>
-  <w:abstractNum w:abstractNumId="89083">
+  <w:abstractNum w:abstractNumId="728473">
     <w:lvl>
       <w:numFmt w:val="bullet"/>
       <w:suff w:val="tab"/>
@@ -1641,7 +1641,7 @@
       </w:rPr>
     </w:lvl>
   </w:abstractNum>
-  <w:abstractNum w:abstractNumId="89084">
+  <w:abstractNum w:abstractNumId="728474">
     <w:lvl>
       <w:numFmt w:val="bullet"/>
       <w:suff w:val="tab"/>
@@ -1651,7 +1651,7 @@
       </w:rPr>
     </w:lvl>
   </w:abstractNum>
-  <w:abstractNum w:abstractNumId="89085">
+  <w:abstractNum w:abstractNumId="728475">
     <w:lvl>
       <w:numFmt w:val="bullet"/>
       <w:suff w:val="tab"/>
@@ -1661,7 +1661,7 @@
       </w:rPr>
     </w:lvl>
   </w:abstractNum>
-  <w:abstractNum w:abstractNumId="89086">
+  <w:abstractNum w:abstractNumId="728476">
     <w:lvl>
       <w:numFmt w:val="bullet"/>
       <w:suff w:val="tab"/>
@@ -1671,7 +1671,7 @@
       </w:rPr>
     </w:lvl>
   </w:abstractNum>
-  <w:abstractNum w:abstractNumId="89087">
+  <w:abstractNum w:abstractNumId="728477">
     <w:lvl>
       <w:numFmt w:val="bullet"/>
       <w:suff w:val="tab"/>
@@ -1681,7 +1681,7 @@
       </w:rPr>
     </w:lvl>
   </w:abstractNum>
-  <w:abstractNum w:abstractNumId="89088">
+  <w:abstractNum w:abstractNumId="728478">
     <w:lvl>
       <w:numFmt w:val="bullet"/>
       <w:suff w:val="tab"/>
@@ -1691,7 +1691,7 @@
       </w:rPr>
     </w:lvl>
   </w:abstractNum>
-  <w:abstractNum w:abstractNumId="89089">
+  <w:abstractNum w:abstractNumId="728479">
     <w:lvl>
       <w:numFmt w:val="bullet"/>
       <w:suff w:val="tab"/>
@@ -1701,7 +1701,7 @@
       </w:rPr>
     </w:lvl>
   </w:abstractNum>
-  <w:abstractNum w:abstractNumId="89090">
+  <w:abstractNum w:abstractNumId="728480">
     <w:lvl>
       <w:numFmt w:val="bullet"/>
       <w:suff w:val="tab"/>
@@ -1712,97 +1712,97 @@
     </w:lvl>
   </w:abstractNum>
   <w:num w:numId="1">
-    <w:abstractNumId w:val="89060"/>
+    <w:abstractNumId w:val="728450"/>
   </w:num>
   <w:num w:numId="2">
-    <w:abstractNumId w:val="89061"/>
+    <w:abstractNumId w:val="728451"/>
   </w:num>
   <w:num w:numId="3">
-    <w:abstractNumId w:val="89062"/>
+    <w:abstractNumId w:val="728452"/>
   </w:num>
   <w:num w:numId="4">
-    <w:abstractNumId w:val="89063"/>
+    <w:abstractNumId w:val="728453"/>
   </w:num>
   <w:num w:numId="5">
-    <w:abstractNumId w:val="89064"/>
+    <w:abstractNumId w:val="728454"/>
   </w:num>
   <w:num w:numId="6">
-    <w:abstractNumId w:val="89065"/>
+    <w:abstractNumId w:val="728455"/>
   </w:num>
   <w:num w:numId="7">
-    <w:abstractNumId w:val="89066"/>
+    <w:abstractNumId w:val="728456"/>
   </w:num>
   <w:num w:numId="8">
-    <w:abstractNumId w:val="89067"/>
+    <w:abstractNumId w:val="728457"/>
   </w:num>
   <w:num w:numId="9">
-    <w:abstractNumId w:val="89068"/>
+    <w:abstractNumId w:val="728458"/>
   </w:num>
   <w:num w:numId="10">
-    <w:abstractNumId w:val="89069"/>
+    <w:abstractNumId w:val="728459"/>
   </w:num>
   <w:num w:numId="11">
-    <w:abstractNumId w:val="89070"/>
+    <w:abstractNumId w:val="728460"/>
   </w:num>
   <w:num w:numId="12">
-    <w:abstractNumId w:val="89071"/>
+    <w:abstractNumId w:val="728461"/>
   </w:num>
   <w:num w:numId="13">
-    <w:abstractNumId w:val="89072"/>
+    <w:abstractNumId w:val="728462"/>
   </w:num>
   <w:num w:numId="14">
-    <w:abstractNumId w:val="89073"/>
+    <w:abstractNumId w:val="728463"/>
   </w:num>
   <w:num w:numId="15">
-    <w:abstractNumId w:val="89074"/>
+    <w:abstractNumId w:val="728464"/>
   </w:num>
   <w:num w:numId="16">
-    <w:abstractNumId w:val="89075"/>
+    <w:abstractNumId w:val="728465"/>
   </w:num>
   <w:num w:numId="17">
-    <w:abstractNumId w:val="89076"/>
+    <w:abstractNumId w:val="728466"/>
   </w:num>
   <w:num w:numId="18">
-    <w:abstractNumId w:val="89077"/>
+    <w:abstractNumId w:val="728467"/>
   </w:num>
   <w:num w:numId="19">
-    <w:abstractNumId w:val="89078"/>
+    <w:abstractNumId w:val="728468"/>
   </w:num>
   <w:num w:numId="20">
-    <w:abstractNumId w:val="89079"/>
+    <w:abstractNumId w:val="728469"/>
   </w:num>
   <w:num w:numId="21">
-    <w:abstractNumId w:val="89080"/>
+    <w:abstractNumId w:val="728470"/>
   </w:num>
   <w:num w:numId="22">
-    <w:abstractNumId w:val="89081"/>
+    <w:abstractNumId w:val="728471"/>
   </w:num>
   <w:num w:numId="23">
-    <w:abstractNumId w:val="89082"/>
+    <w:abstractNumId w:val="728472"/>
   </w:num>
   <w:num w:numId="24">
-    <w:abstractNumId w:val="89083"/>
+    <w:abstractNumId w:val="728473"/>
   </w:num>
   <w:num w:numId="25">
-    <w:abstractNumId w:val="89084"/>
+    <w:abstractNumId w:val="728474"/>
   </w:num>
   <w:num w:numId="26">
-    <w:abstractNumId w:val="89085"/>
+    <w:abstractNumId w:val="728475"/>
   </w:num>
   <w:num w:numId="27">
-    <w:abstractNumId w:val="89086"/>
+    <w:abstractNumId w:val="728476"/>
   </w:num>
   <w:num w:numId="28">
-    <w:abstractNumId w:val="89087"/>
+    <w:abstractNumId w:val="728477"/>
   </w:num>
   <w:num w:numId="29">
-    <w:abstractNumId w:val="89088"/>
+    <w:abstractNumId w:val="728478"/>
   </w:num>
   <w:num w:numId="30">
-    <w:abstractNumId w:val="89089"/>
+    <w:abstractNumId w:val="728479"/>
   </w:num>
   <w:num w:numId="31">
-    <w:abstractNumId w:val="89090"/>
+    <w:abstractNumId w:val="728480"/>
   </w:num>
 </w:numbering>
 </file>

</xml_diff>